<commit_message>
update CV and resume
</commit_message>
<xml_diff>
--- a/docs/AcademicCV.docx
+++ b/docs/AcademicCV.docx
@@ -2347,7 +2347,7 @@
           <w:szCs w:val="24"/>
           <w:lang w:bidi="fa-IR"/>
         </w:rPr>
-        <w:t>Apr</w:t>
+        <w:t>June</w:t>
       </w:r>
       <w:r>
         <w:rPr>
@@ -2399,7 +2399,7 @@
         <w:rPr>
           <w:rFonts w:ascii="Roboto" w:hAnsi="Roboto"/>
         </w:rPr>
-        <w:t>Apr</w:t>
+        <w:t>June</w:t>
       </w:r>
       <w:r>
         <w:rPr>
@@ -2538,7 +2538,7 @@
         <w:rPr>
           <w:rFonts w:ascii="Roboto" w:hAnsi="Roboto"/>
         </w:rPr>
-        <w:t>Apr</w:t>
+        <w:t>May</w:t>
       </w:r>
       <w:r>
         <w:rPr>
@@ -2657,13 +2657,13 @@
         <w:rPr>
           <w:rFonts w:ascii="Roboto" w:hAnsi="Roboto"/>
         </w:rPr>
-        <w:t>Mar</w:t>
-      </w:r>
-      <w:r>
-        <w:rPr>
-          <w:rFonts w:ascii="Roboto" w:hAnsi="Roboto"/>
-        </w:rPr>
-        <w:t xml:space="preserve"> 202</w:t>
+        <w:t xml:space="preserve">Apr </w:t>
+      </w:r>
+      <w:r>
+        <w:rPr>
+          <w:rFonts w:ascii="Roboto" w:hAnsi="Roboto"/>
+        </w:rPr>
+        <w:t>202</w:t>
       </w:r>
       <w:r>
         <w:rPr>
@@ -2814,26 +2814,20 @@
         </w:rPr>
         <w:tab/>
       </w:r>
-      <w:r>
-        <w:rPr>
-          <w:rFonts w:ascii="Roboto" w:hAnsi="Roboto"/>
-          <w:b/>
-          <w:bCs/>
-          <w:sz w:val="24"/>
-          <w:szCs w:val="24"/>
-        </w:rPr>
-        <w:t xml:space="preserve">Object-Oriented </w:t>
-      </w:r>
-      <w:r>
-        <w:rPr>
-          <w:rFonts w:ascii="Roboto" w:hAnsi="Roboto"/>
-          <w:b/>
-          <w:bCs/>
-          <w:sz w:val="24"/>
-          <w:szCs w:val="24"/>
-        </w:rPr>
-        <w:t>Design</w:t>
-      </w:r>
+      <w:hyperlink r:id="rId14" w:history="1">
+        <w:r>
+          <w:rPr>
+            <w:rStyle w:val="Hyperlink"/>
+            <w:rFonts w:ascii="Roboto" w:hAnsi="Roboto"/>
+            <w:b/>
+            <w:bCs/>
+            <w:sz w:val="24"/>
+            <w:szCs w:val="24"/>
+            <w:u w:val="none"/>
+          </w:rPr>
+          <w:t>Object-Oriented Design</w:t>
+        </w:r>
+      </w:hyperlink>
     </w:p>
     <w:p>
       <w:pPr>
@@ -2887,7 +2881,7 @@
           <w:rFonts w:ascii="Roboto" w:hAnsi="Roboto"/>
           <w:lang w:bidi="fa-IR"/>
         </w:rPr>
-        <w:t>0</w:t>
+        <w:t>95.80</w:t>
       </w:r>
       <w:r>
         <w:rPr>
@@ -2934,7 +2928,7 @@
         </w:rPr>
         <w:tab/>
       </w:r>
-      <w:hyperlink r:id="rId14" w:history="1">
+      <w:hyperlink r:id="rId15" w:history="1">
         <w:r>
           <w:rPr>
             <w:rStyle w:val="Hyperlink"/>
@@ -3035,7 +3029,7 @@
         </w:rPr>
         <w:t xml:space="preserve">      </w:t>
       </w:r>
-      <w:hyperlink r:id="rId15" w:history="1">
+      <w:hyperlink r:id="rId16" w:history="1">
         <w:r>
           <w:rPr>
             <w:rStyle w:val="Hyperlink"/>
@@ -3090,7 +3084,7 @@
         </w:rPr>
         <w:tab/>
       </w:r>
-      <w:hyperlink r:id="rId16" w:history="1">
+      <w:hyperlink r:id="rId17" w:history="1">
         <w:r>
           <w:rPr>
             <w:rStyle w:val="Hyperlink"/>
@@ -3205,7 +3199,7 @@
         </w:rPr>
         <w:tab/>
       </w:r>
-      <w:hyperlink r:id="rId17" w:history="1">
+      <w:hyperlink r:id="rId18" w:history="1">
         <w:r>
           <w:rPr>
             <w:rStyle w:val="Hyperlink"/>
@@ -3301,7 +3295,7 @@
         </w:rPr>
         <w:tab/>
       </w:r>
-      <w:hyperlink r:id="rId18" w:history="1">
+      <w:hyperlink r:id="rId19" w:history="1">
         <w:r>
           <w:rPr>
             <w:rStyle w:val="Hyperlink"/>
@@ -3421,7 +3415,7 @@
         </w:rPr>
         <w:tab/>
       </w:r>
-      <w:hyperlink r:id="rId19" w:history="1">
+      <w:hyperlink r:id="rId20" w:history="1">
         <w:r>
           <w:rPr>
             <w:rStyle w:val="Hyperlink"/>
@@ -3529,7 +3523,7 @@
         </w:rPr>
         <w:tab/>
       </w:r>
-      <w:hyperlink r:id="rId20" w:history="1">
+      <w:hyperlink r:id="rId21" w:history="1">
         <w:r>
           <w:rPr>
             <w:rStyle w:val="Hyperlink"/>
@@ -3764,7 +3758,7 @@
         </w:rPr>
         <w:t xml:space="preserve">Title: </w:t>
       </w:r>
-      <w:hyperlink r:id="rId21" w:history="1">
+      <w:hyperlink r:id="rId22" w:history="1">
         <w:r>
           <w:rPr>
             <w:rStyle w:val="Hyperlink"/>
@@ -3924,7 +3918,7 @@
         </w:rPr>
         <w:t xml:space="preserve">: </w:t>
       </w:r>
-      <w:hyperlink r:id="rId22" w:history="1">
+      <w:hyperlink r:id="rId23" w:history="1">
         <w:r>
           <w:rPr>
             <w:rStyle w:val="Hyperlink"/>
@@ -4176,7 +4170,7 @@
         </w:rPr>
         <w:t xml:space="preserve"> </w:t>
       </w:r>
-      <w:hyperlink r:id="rId23" w:history="1">
+      <w:hyperlink r:id="rId24" w:history="1">
         <w:r>
           <w:rPr>
             <w:rStyle w:val="Hyperlink"/>
@@ -5628,7 +5622,7 @@
           <w:lang w:bidi="fa-IR"/>
         </w:rPr>
       </w:pPr>
-      <w:hyperlink r:id="rId24" w:history="1">
+      <w:hyperlink r:id="rId25" w:history="1">
         <w:r>
           <w:rPr>
             <w:rStyle w:val="Hyperlink"/>
@@ -5750,7 +5744,7 @@
         </w:rPr>
         <w:t xml:space="preserve">Email: </w:t>
       </w:r>
-      <w:hyperlink r:id="rId25" w:history="1">
+      <w:hyperlink r:id="rId26" w:history="1">
         <w:r>
           <w:rPr>
             <w:rStyle w:val="Hyperlink"/>
@@ -5778,7 +5772,7 @@
           <w:lang w:bidi="fa-IR"/>
         </w:rPr>
       </w:pPr>
-      <w:hyperlink r:id="rId26" w:history="1">
+      <w:hyperlink r:id="rId27" w:history="1">
         <w:r>
           <w:rPr>
             <w:rStyle w:val="Hyperlink"/>
@@ -5890,7 +5884,7 @@
         </w:rPr>
         <w:t xml:space="preserve">Email: </w:t>
       </w:r>
-      <w:hyperlink r:id="rId27" w:history="1">
+      <w:hyperlink r:id="rId28" w:history="1">
         <w:r>
           <w:rPr>
             <w:rStyle w:val="Hyperlink"/>
@@ -5920,7 +5914,7 @@
           <w:lang w:bidi="fa-IR"/>
         </w:rPr>
       </w:pPr>
-      <w:hyperlink r:id="rId28" w:history="1">
+      <w:hyperlink r:id="rId29" w:history="1">
         <w:r>
           <w:rPr>
             <w:rStyle w:val="Hyperlink"/>
@@ -6013,7 +6007,7 @@
         </w:rPr>
         <w:t xml:space="preserve"> </w:t>
       </w:r>
-      <w:hyperlink r:id="rId29" w:history="1">
+      <w:hyperlink r:id="rId30" w:history="1">
         <w:r>
           <w:rPr>
             <w:rStyle w:val="Hyperlink"/>

</xml_diff>

<commit_message>
Update CV by adding new certificate & fix some parts
</commit_message>
<xml_diff>
--- a/docs/AcademicCV.docx
+++ b/docs/AcademicCV.docx
@@ -1,6 +1,6 @@
 
 <file path=word/document.xml><?xml version="1.0" encoding="utf-8"?>
-<w:document xmlns:wpc="http://schemas.microsoft.com/office/word/2010/wordprocessingCanvas" xmlns:cx="http://schemas.microsoft.com/office/drawing/2014/chartex" xmlns:cx1="http://schemas.microsoft.com/office/drawing/2015/9/8/chartex" xmlns:cx2="http://schemas.microsoft.com/office/drawing/2015/10/21/chartex" xmlns:cx3="http://schemas.microsoft.com/office/drawing/2016/5/9/chartex" xmlns:cx4="http://schemas.microsoft.com/office/drawing/2016/5/10/chartex" xmlns:cx5="http://schemas.microsoft.com/office/drawing/2016/5/11/chartex" xmlns:cx6="http://schemas.microsoft.com/office/drawing/2016/5/12/chartex" xmlns:cx7="http://schemas.microsoft.com/office/drawing/2016/5/13/chartex" xmlns:cx8="http://schemas.microsoft.com/office/drawing/2016/5/14/chartex" xmlns:mc="http://schemas.openxmlformats.org/markup-compatibility/2006" xmlns:aink="http://schemas.microsoft.com/office/drawing/2016/ink" xmlns:am3d="http://schemas.microsoft.com/office/drawing/2017/model3d" xmlns:o="urn:schemas-microsoft-com:office:office" xmlns:r="http://schemas.openxmlformats.org/officeDocument/2006/relationships" xmlns:m="http://schemas.openxmlformats.org/officeDocument/2006/math" xmlns:v="urn:schemas-microsoft-com:vml" xmlns:wp14="http://schemas.microsoft.com/office/word/2010/wordprocessingDrawing" xmlns:wp="http://schemas.openxmlformats.org/drawingml/2006/wordprocessingDrawing" xmlns:w10="urn:schemas-microsoft-com:office:word" xmlns:w="http://schemas.openxmlformats.org/wordprocessingml/2006/main" xmlns:w14="http://schemas.microsoft.com/office/word/2010/wordml" xmlns:w15="http://schemas.microsoft.com/office/word/2012/wordml" xmlns:w16cex="http://schemas.microsoft.com/office/word/2018/wordml/cex" xmlns:w16cid="http://schemas.microsoft.com/office/word/2016/wordml/cid" xmlns:w16="http://schemas.microsoft.com/office/word/2018/wordml" xmlns:w16sdtdh="http://schemas.microsoft.com/office/word/2020/wordml/sdtdatahash" xmlns:w16se="http://schemas.microsoft.com/office/word/2015/wordml/symex" xmlns:wpg="http://schemas.microsoft.com/office/word/2010/wordprocessingGroup" xmlns:wpi="http://schemas.microsoft.com/office/word/2010/wordprocessingInk" xmlns:wne="http://schemas.microsoft.com/office/word/2006/wordml" xmlns:wps="http://schemas.microsoft.com/office/word/2010/wordprocessingShape" mc:Ignorable="w14 w15 w16se w16cid w16 w16cex w16sdtdh wp14">
+<w:document xmlns:wpc="http://schemas.microsoft.com/office/word/2010/wordprocessingCanvas" xmlns:cx="http://schemas.microsoft.com/office/drawing/2014/chartex" xmlns:cx1="http://schemas.microsoft.com/office/drawing/2015/9/8/chartex" xmlns:cx2="http://schemas.microsoft.com/office/drawing/2015/10/21/chartex" xmlns:cx3="http://schemas.microsoft.com/office/drawing/2016/5/9/chartex" xmlns:cx4="http://schemas.microsoft.com/office/drawing/2016/5/10/chartex" xmlns:cx5="http://schemas.microsoft.com/office/drawing/2016/5/11/chartex" xmlns:cx6="http://schemas.microsoft.com/office/drawing/2016/5/12/chartex" xmlns:cx7="http://schemas.microsoft.com/office/drawing/2016/5/13/chartex" xmlns:cx8="http://schemas.microsoft.com/office/drawing/2016/5/14/chartex" xmlns:mc="http://schemas.openxmlformats.org/markup-compatibility/2006" xmlns:aink="http://schemas.microsoft.com/office/drawing/2016/ink" xmlns:am3d="http://schemas.microsoft.com/office/drawing/2017/model3d" xmlns:o="urn:schemas-microsoft-com:office:office" xmlns:oel="http://schemas.microsoft.com/office/2019/extlst" xmlns:r="http://schemas.openxmlformats.org/officeDocument/2006/relationships" xmlns:m="http://schemas.openxmlformats.org/officeDocument/2006/math" xmlns:v="urn:schemas-microsoft-com:vml" xmlns:wp14="http://schemas.microsoft.com/office/word/2010/wordprocessingDrawing" xmlns:wp="http://schemas.openxmlformats.org/drawingml/2006/wordprocessingDrawing" xmlns:w10="urn:schemas-microsoft-com:office:word" xmlns:w="http://schemas.openxmlformats.org/wordprocessingml/2006/main" xmlns:w14="http://schemas.microsoft.com/office/word/2010/wordml" xmlns:w15="http://schemas.microsoft.com/office/word/2012/wordml" xmlns:w16cex="http://schemas.microsoft.com/office/word/2018/wordml/cex" xmlns:w16cid="http://schemas.microsoft.com/office/word/2016/wordml/cid" xmlns:w16="http://schemas.microsoft.com/office/word/2018/wordml" xmlns:w16sdtdh="http://schemas.microsoft.com/office/word/2020/wordml/sdtdatahash" xmlns:w16se="http://schemas.microsoft.com/office/word/2015/wordml/symex" xmlns:wpg="http://schemas.microsoft.com/office/word/2010/wordprocessingGroup" xmlns:wpi="http://schemas.microsoft.com/office/word/2010/wordprocessingInk" xmlns:wne="http://schemas.microsoft.com/office/word/2006/wordml" xmlns:wps="http://schemas.microsoft.com/office/word/2010/wordprocessingShape" mc:Ignorable="w14 w15 w16se w16cid w16 w16cex w16sdtdh wp14">
   <w:body>
     <w:p>
       <w:pPr>
@@ -535,6 +535,69 @@
       <w:r>
         <w:rPr>
           <w:rFonts w:ascii="Roboto" w:hAnsi="Roboto"/>
+          <w:lang w:bidi="fa-IR"/>
+        </w:rPr>
+        <w:t xml:space="preserve">Feb </w:t>
+      </w:r>
+      <w:r>
+        <w:rPr>
+          <w:rFonts w:ascii="Roboto" w:hAnsi="Roboto"/>
+          <w:lang w:bidi="fa-IR"/>
+        </w:rPr>
+        <w:t>202</w:t>
+      </w:r>
+      <w:r>
+        <w:rPr>
+          <w:rFonts w:ascii="Roboto" w:hAnsi="Roboto"/>
+          <w:lang w:bidi="fa-IR"/>
+        </w:rPr>
+        <w:t>2</w:t>
+      </w:r>
+      <w:r>
+        <w:rPr>
+          <w:rFonts w:ascii="Roboto" w:hAnsi="Roboto"/>
+          <w:lang w:bidi="fa-IR"/>
+        </w:rPr>
+        <w:t>-</w:t>
+      </w:r>
+      <w:r>
+        <w:rPr>
+          <w:rFonts w:ascii="Roboto" w:hAnsi="Roboto"/>
+          <w:lang w:bidi="fa-IR"/>
+        </w:rPr>
+        <w:t>Jun</w:t>
+      </w:r>
+      <w:r>
+        <w:rPr>
+          <w:rFonts w:ascii="Roboto" w:hAnsi="Roboto"/>
+          <w:lang w:bidi="fa-IR"/>
+        </w:rPr>
+        <w:t xml:space="preserve"> </w:t>
+      </w:r>
+      <w:r>
+        <w:rPr>
+          <w:rFonts w:ascii="Roboto" w:hAnsi="Roboto"/>
+          <w:lang w:bidi="fa-IR"/>
+        </w:rPr>
+        <w:t>202</w:t>
+      </w:r>
+      <w:r>
+        <w:rPr>
+          <w:rFonts w:ascii="Roboto" w:hAnsi="Roboto"/>
+          <w:lang w:bidi="fa-IR"/>
+        </w:rPr>
+        <w:t>2</w:t>
+      </w:r>
+      <w:r>
+        <w:rPr>
+          <w:rFonts w:ascii="Roboto" w:hAnsi="Roboto"/>
+          <w:lang w:bidi="fa-IR"/>
+        </w:rPr>
+        <w:tab/>
+      </w:r>
+      <w:r>
+        <w:rPr>
+          <w:rFonts w:ascii="Roboto" w:hAnsi="Roboto"/>
           <w:b/>
           <w:bCs/>
           <w:sz w:val="24"/>
@@ -600,14 +663,6 @@
         </w:rPr>
         <w:t>Islamic Azad University</w:t>
       </w:r>
-      <w:r>
-        <w:rPr>
-          <w:rFonts w:ascii="Roboto" w:hAnsi="Roboto"/>
-          <w:sz w:val="24"/>
-          <w:szCs w:val="24"/>
-        </w:rPr>
-        <w:t>, Winter 2022</w:t>
-      </w:r>
     </w:p>
     <w:p>
       <w:pPr>
@@ -668,6 +723,76 @@
           <w:szCs w:val="24"/>
         </w:rPr>
       </w:pPr>
+      <w:r>
+        <w:rPr>
+          <w:rFonts w:ascii="Roboto" w:hAnsi="Roboto"/>
+          <w:lang w:bidi="fa-IR"/>
+        </w:rPr>
+        <w:t xml:space="preserve">Feb </w:t>
+      </w:r>
+      <w:r>
+        <w:rPr>
+          <w:rFonts w:ascii="Roboto" w:hAnsi="Roboto"/>
+          <w:lang w:bidi="fa-IR"/>
+        </w:rPr>
+        <w:t>202</w:t>
+      </w:r>
+      <w:r>
+        <w:rPr>
+          <w:rFonts w:ascii="Roboto" w:hAnsi="Roboto"/>
+          <w:lang w:bidi="fa-IR"/>
+        </w:rPr>
+        <w:t>2</w:t>
+      </w:r>
+      <w:r>
+        <w:rPr>
+          <w:rFonts w:ascii="Roboto" w:hAnsi="Roboto"/>
+          <w:lang w:bidi="fa-IR"/>
+        </w:rPr>
+        <w:t>-</w:t>
+      </w:r>
+      <w:r>
+        <w:rPr>
+          <w:rFonts w:ascii="Roboto" w:hAnsi="Roboto"/>
+          <w:lang w:bidi="fa-IR"/>
+        </w:rPr>
+        <w:t>J</w:t>
+      </w:r>
+      <w:r>
+        <w:rPr>
+          <w:rFonts w:ascii="Roboto" w:hAnsi="Roboto"/>
+          <w:lang w:bidi="fa-IR"/>
+        </w:rPr>
+        <w:t>u</w:t>
+      </w:r>
+      <w:r>
+        <w:rPr>
+          <w:rFonts w:ascii="Roboto" w:hAnsi="Roboto"/>
+          <w:lang w:bidi="fa-IR"/>
+        </w:rPr>
+        <w:t>n</w:t>
+      </w:r>
+      <w:r>
+        <w:rPr>
+          <w:rFonts w:ascii="Roboto" w:hAnsi="Roboto"/>
+          <w:lang w:bidi="fa-IR"/>
+        </w:rPr>
+        <w:t xml:space="preserve"> 202</w:t>
+      </w:r>
+      <w:r>
+        <w:rPr>
+          <w:rFonts w:ascii="Roboto" w:hAnsi="Roboto"/>
+          <w:lang w:bidi="fa-IR"/>
+        </w:rPr>
+        <w:t>2</w:t>
+      </w:r>
+      <w:r>
+        <w:rPr>
+          <w:rFonts w:ascii="Roboto" w:hAnsi="Roboto"/>
+          <w:lang w:bidi="fa-IR"/>
+        </w:rPr>
+        <w:tab/>
+      </w:r>
       <w:r>
         <w:rPr>
           <w:rFonts w:ascii="Roboto" w:hAnsi="Roboto"/>
@@ -706,15 +831,7 @@
           <w:sz w:val="24"/>
           <w:szCs w:val="24"/>
         </w:rPr>
-        <w:t xml:space="preserve">, University of Zanjan, </w:t>
-      </w:r>
-      <w:r>
-        <w:rPr>
-          <w:rFonts w:ascii="Roboto" w:hAnsi="Roboto"/>
-          <w:sz w:val="24"/>
-          <w:szCs w:val="24"/>
-        </w:rPr>
-        <w:t>Winter 2022</w:t>
+        <w:t>, University of Zanjan</w:t>
       </w:r>
     </w:p>
     <w:p>
@@ -779,6 +896,48 @@
       <w:r>
         <w:rPr>
           <w:rFonts w:ascii="Roboto" w:hAnsi="Roboto"/>
+          <w:lang w:bidi="fa-IR"/>
+        </w:rPr>
+        <w:t>Sep</w:t>
+      </w:r>
+      <w:r>
+        <w:rPr>
+          <w:rFonts w:ascii="Roboto" w:hAnsi="Roboto"/>
+          <w:lang w:bidi="fa-IR"/>
+        </w:rPr>
+        <w:t xml:space="preserve"> 2021-</w:t>
+      </w:r>
+      <w:r>
+        <w:rPr>
+          <w:rFonts w:ascii="Roboto" w:hAnsi="Roboto"/>
+          <w:lang w:bidi="fa-IR"/>
+        </w:rPr>
+        <w:t>Jan</w:t>
+      </w:r>
+      <w:r>
+        <w:rPr>
+          <w:rFonts w:ascii="Roboto" w:hAnsi="Roboto"/>
+          <w:lang w:bidi="fa-IR"/>
+        </w:rPr>
+        <w:t xml:space="preserve"> 202</w:t>
+      </w:r>
+      <w:r>
+        <w:rPr>
+          <w:rFonts w:ascii="Roboto" w:hAnsi="Roboto"/>
+          <w:lang w:bidi="fa-IR"/>
+        </w:rPr>
+        <w:t>2</w:t>
+      </w:r>
+      <w:r>
+        <w:rPr>
+          <w:rFonts w:ascii="Roboto" w:hAnsi="Roboto"/>
+          <w:lang w:bidi="fa-IR"/>
+        </w:rPr>
+        <w:tab/>
+      </w:r>
+      <w:r>
+        <w:rPr>
+          <w:rFonts w:ascii="Roboto" w:hAnsi="Roboto"/>
           <w:b/>
           <w:bCs/>
           <w:sz w:val="24"/>
@@ -802,7 +961,7 @@
           <w:sz w:val="24"/>
           <w:szCs w:val="24"/>
         </w:rPr>
-        <w:t>Digital Logic Design, University of Zanjan, Fall 2021</w:t>
+        <w:t>Digital Logic Design, University of Zanjan</w:t>
       </w:r>
     </w:p>
     <w:p>
@@ -924,12 +1083,9 @@
     </w:p>
     <w:p>
       <w:pPr>
-        <w:rPr>
-          <w:rFonts w:ascii="Roboto" w:hAnsi="Roboto"/>
-          <w:b/>
-          <w:bCs/>
-          <w:sz w:val="28"/>
-          <w:szCs w:val="28"/>
+        <w:spacing w:line="276" w:lineRule="auto"/>
+        <w:rPr>
+          <w:rFonts w:ascii="Roboto" w:hAnsi="Roboto"/>
         </w:rPr>
       </w:pPr>
     </w:p>
@@ -1221,7 +1377,6 @@
           <w:szCs w:val="28"/>
           <w:lang w:bidi="fa-IR"/>
         </w:rPr>
-        <w:lastRenderedPageBreak/>
         <w:t>CORE COURSES</w:t>
       </w:r>
     </w:p>
@@ -2312,6 +2467,79 @@
           <w:lang w:bidi="fa-IR"/>
         </w:rPr>
       </w:pPr>
+      <w:r>
+        <w:rPr>
+          <w:b/>
+          <w:bCs/>
+          <w:noProof/>
+          <w:sz w:val="20"/>
+          <w:szCs w:val="20"/>
+        </w:rPr>
+        <mc:AlternateContent>
+          <mc:Choice Requires="wps">
+            <w:drawing>
+              <wp:anchor distT="0" distB="0" distL="114300" distR="114300" simplePos="0" relativeHeight="251677696" behindDoc="0" locked="0" layoutInCell="1" allowOverlap="1" wp14:anchorId="3878A8F8" wp14:editId="607FD77A">
+                <wp:simplePos x="0" y="0"/>
+                <wp:positionH relativeFrom="column">
+                  <wp:posOffset>-328930</wp:posOffset>
+                </wp:positionH>
+                <wp:positionV relativeFrom="paragraph">
+                  <wp:posOffset>46174</wp:posOffset>
+                </wp:positionV>
+                <wp:extent cx="6638290" cy="0"/>
+                <wp:effectExtent l="0" t="0" r="0" b="0"/>
+                <wp:wrapNone/>
+                <wp:docPr id="8" name="Straight Connector 8"/>
+                <wp:cNvGraphicFramePr/>
+                <a:graphic xmlns:a="http://schemas.openxmlformats.org/drawingml/2006/main">
+                  <a:graphicData uri="http://schemas.microsoft.com/office/word/2010/wordprocessingShape">
+                    <wps:wsp>
+                      <wps:cNvCnPr/>
+                      <wps:spPr>
+                        <a:xfrm flipV="1">
+                          <a:off x="0" y="0"/>
+                          <a:ext cx="6638290" cy="0"/>
+                        </a:xfrm>
+                        <a:prstGeom prst="line">
+                          <a:avLst/>
+                        </a:prstGeom>
+                      </wps:spPr>
+                      <wps:style>
+                        <a:lnRef idx="1">
+                          <a:schemeClr val="dk1"/>
+                        </a:lnRef>
+                        <a:fillRef idx="0">
+                          <a:schemeClr val="dk1"/>
+                        </a:fillRef>
+                        <a:effectRef idx="0">
+                          <a:schemeClr val="dk1"/>
+                        </a:effectRef>
+                        <a:fontRef idx="minor">
+                          <a:schemeClr val="tx1"/>
+                        </a:fontRef>
+                      </wps:style>
+                      <wps:bodyPr/>
+                    </wps:wsp>
+                  </a:graphicData>
+                </a:graphic>
+                <wp14:sizeRelH relativeFrom="margin">
+                  <wp14:pctWidth>0</wp14:pctWidth>
+                </wp14:sizeRelH>
+                <wp14:sizeRelV relativeFrom="margin">
+                  <wp14:pctHeight>0</wp14:pctHeight>
+                </wp14:sizeRelV>
+              </wp:anchor>
+            </w:drawing>
+          </mc:Choice>
+          <mc:Fallback>
+            <w:pict>
+              <v:line w14:anchorId="43D37387" id="Straight Connector 8" o:spid="_x0000_s1026" style="position:absolute;flip:y;z-index:251677696;visibility:visible;mso-wrap-style:square;mso-width-percent:0;mso-height-percent:0;mso-wrap-distance-left:9pt;mso-wrap-distance-top:0;mso-wrap-distance-right:9pt;mso-wrap-distance-bottom:0;mso-position-horizontal:absolute;mso-position-horizontal-relative:text;mso-position-vertical:absolute;mso-position-vertical-relative:text;mso-width-percent:0;mso-height-percent:0;mso-width-relative:margin;mso-height-relative:margin" from="-25.9pt,3.65pt" to="496.8pt,3.65pt" o:gfxdata="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" strokecolor="black [3200]" strokeweight=".5pt">
+                <v:stroke joinstyle="miter"/>
+              </v:line>
+            </w:pict>
+          </mc:Fallback>
+        </mc:AlternateContent>
+      </w:r>
     </w:p>
     <w:p>
       <w:pPr>
@@ -2358,6 +2586,89 @@
           <w:rFonts w:ascii="Roboto" w:hAnsi="Roboto"/>
           <w:b/>
           <w:bCs/>
+          <w:sz w:val="26"/>
+          <w:szCs w:val="26"/>
+        </w:rPr>
+      </w:pPr>
+      <w:r>
+        <w:rPr>
+          <w:rFonts w:ascii="Roboto" w:hAnsi="Roboto"/>
+          <w:sz w:val="24"/>
+          <w:szCs w:val="24"/>
+        </w:rPr>
+        <w:t>Apr 2022</w:t>
+      </w:r>
+      <w:r>
+        <w:rPr>
+          <w:rFonts w:ascii="Roboto" w:hAnsi="Roboto"/>
+          <w:sz w:val="24"/>
+          <w:szCs w:val="24"/>
+        </w:rPr>
+        <w:tab/>
+      </w:r>
+      <w:hyperlink r:id="rId14" w:history="1">
+        <w:r>
+          <w:rPr>
+            <w:rStyle w:val="Hyperlink"/>
+            <w:rFonts w:ascii="Roboto" w:hAnsi="Roboto"/>
+            <w:b/>
+            <w:bCs/>
+            <w:sz w:val="26"/>
+            <w:szCs w:val="26"/>
+            <w:u w:val="none"/>
+          </w:rPr>
+          <w:t>Machine Learning with Python</w:t>
+        </w:r>
+      </w:hyperlink>
+    </w:p>
+    <w:p>
+      <w:pPr>
+        <w:pStyle w:val="ListParagraph"/>
+        <w:tabs>
+          <w:tab w:val="left" w:pos="5280"/>
+        </w:tabs>
+        <w:spacing w:line="276" w:lineRule="auto"/>
+        <w:rPr>
+          <w:rFonts w:ascii="Roboto" w:hAnsi="Roboto"/>
+          <w:lang w:bidi="fa-IR"/>
+        </w:rPr>
+      </w:pPr>
+      <w:r>
+        <w:rPr>
+          <w:rFonts w:ascii="Roboto" w:hAnsi="Roboto"/>
+          <w:lang w:bidi="fa-IR"/>
+        </w:rPr>
+        <w:t xml:space="preserve">             Maktabkhoone, </w:t>
+      </w:r>
+      <w:r>
+        <w:rPr>
+          <w:rFonts w:ascii="Roboto" w:hAnsi="Roboto"/>
+          <w:lang w:bidi="fa-IR"/>
+        </w:rPr>
+        <w:t xml:space="preserve">Grade: </w:t>
+      </w:r>
+      <w:r>
+        <w:rPr>
+          <w:rFonts w:ascii="Roboto" w:hAnsi="Roboto"/>
+          <w:lang w:bidi="fa-IR"/>
+        </w:rPr>
+        <w:t>95</w:t>
+      </w:r>
+      <w:r>
+        <w:rPr>
+          <w:rFonts w:ascii="Roboto" w:hAnsi="Roboto"/>
+          <w:lang w:bidi="fa-IR"/>
+        </w:rPr>
+        <w:t>/100</w:t>
+      </w:r>
+    </w:p>
+    <w:p>
+      <w:pPr>
+        <w:spacing w:line="276" w:lineRule="auto"/>
+        <w:rPr>
+          <w:rFonts w:ascii="Roboto" w:hAnsi="Roboto"/>
+          <w:b/>
+          <w:bCs/>
           <w:sz w:val="24"/>
           <w:szCs w:val="24"/>
         </w:rPr>
@@ -2388,7 +2699,7 @@
         </w:rPr>
         <w:tab/>
       </w:r>
-      <w:hyperlink r:id="rId14" w:history="1">
+      <w:hyperlink r:id="rId15" w:history="1">
         <w:r>
           <w:rPr>
             <w:rStyle w:val="Hyperlink"/>
@@ -2415,6 +2726,7 @@
           <w:lang w:bidi="fa-IR"/>
         </w:rPr>
       </w:pPr>
+      <w:bookmarkStart w:id="1" w:name="_Hlk102394567"/>
       <w:r>
         <w:rPr>
           <w:rFonts w:ascii="Roboto" w:hAnsi="Roboto"/>
@@ -2472,6 +2784,7 @@
         <w:t>/100</w:t>
       </w:r>
     </w:p>
+    <w:bookmarkEnd w:id="1"/>
     <w:p>
       <w:pPr>
         <w:spacing w:line="240" w:lineRule="auto"/>
@@ -2509,7 +2822,7 @@
         </w:rPr>
         <w:tab/>
       </w:r>
-      <w:hyperlink r:id="rId15" w:history="1">
+      <w:hyperlink r:id="rId16" w:history="1">
         <w:r>
           <w:rPr>
             <w:rStyle w:val="Hyperlink"/>
@@ -2610,7 +2923,7 @@
         </w:rPr>
         <w:t xml:space="preserve">      </w:t>
       </w:r>
-      <w:hyperlink r:id="rId16" w:history="1">
+      <w:hyperlink r:id="rId17" w:history="1">
         <w:r>
           <w:rPr>
             <w:rStyle w:val="Hyperlink"/>
@@ -2665,7 +2978,7 @@
         </w:rPr>
         <w:tab/>
       </w:r>
-      <w:hyperlink r:id="rId17" w:history="1">
+      <w:hyperlink r:id="rId18" w:history="1">
         <w:r>
           <w:rPr>
             <w:rStyle w:val="Hyperlink"/>
@@ -2780,7 +3093,7 @@
         </w:rPr>
         <w:tab/>
       </w:r>
-      <w:hyperlink r:id="rId18" w:history="1">
+      <w:hyperlink r:id="rId19" w:history="1">
         <w:r>
           <w:rPr>
             <w:rStyle w:val="Hyperlink"/>
@@ -2876,7 +3189,7 @@
         </w:rPr>
         <w:tab/>
       </w:r>
-      <w:hyperlink r:id="rId19" w:history="1">
+      <w:hyperlink r:id="rId20" w:history="1">
         <w:r>
           <w:rPr>
             <w:rStyle w:val="Hyperlink"/>
@@ -2996,7 +3309,7 @@
         </w:rPr>
         <w:tab/>
       </w:r>
-      <w:hyperlink r:id="rId20" w:history="1">
+      <w:hyperlink r:id="rId21" w:history="1">
         <w:r>
           <w:rPr>
             <w:rStyle w:val="Hyperlink"/>
@@ -3104,7 +3417,7 @@
         </w:rPr>
         <w:tab/>
       </w:r>
-      <w:hyperlink r:id="rId21" w:history="1">
+      <w:hyperlink r:id="rId22" w:history="1">
         <w:r>
           <w:rPr>
             <w:rStyle w:val="Hyperlink"/>
@@ -3339,7 +3652,7 @@
         </w:rPr>
         <w:t xml:space="preserve">Title: </w:t>
       </w:r>
-      <w:hyperlink r:id="rId22" w:history="1">
+      <w:hyperlink r:id="rId23" w:history="1">
         <w:r>
           <w:rPr>
             <w:rStyle w:val="Hyperlink"/>
@@ -3434,6 +3747,7 @@
           <w:rFonts w:ascii="Roboto" w:hAnsi="Roboto"/>
           <w:lang w:bidi="fa-IR"/>
         </w:rPr>
+        <w:lastRenderedPageBreak/>
         <w:t>Apr 202</w:t>
       </w:r>
       <w:r>
@@ -3476,7 +3790,7 @@
           <w:rFonts w:ascii="Roboto" w:hAnsi="Roboto"/>
           <w:lang w:bidi="fa-IR"/>
         </w:rPr>
-        <w:t xml:space="preserve"> </w:t>
+        <w:tab/>
       </w:r>
       <w:r>
         <w:rPr>
@@ -3498,7 +3812,7 @@
         </w:rPr>
         <w:t xml:space="preserve">: </w:t>
       </w:r>
-      <w:hyperlink r:id="rId23" w:history="1">
+      <w:hyperlink r:id="rId24" w:history="1">
         <w:r>
           <w:rPr>
             <w:rStyle w:val="Hyperlink"/>
@@ -3721,7 +4035,14 @@
           <w:rFonts w:ascii="Roboto" w:hAnsi="Roboto"/>
           <w:lang w:bidi="fa-IR"/>
         </w:rPr>
-        <w:t xml:space="preserve">Aug 2019 </w:t>
+        <w:t>Aug 2019</w:t>
+      </w:r>
+      <w:r>
+        <w:rPr>
+          <w:rFonts w:ascii="Roboto" w:hAnsi="Roboto"/>
+          <w:lang w:bidi="fa-IR"/>
+        </w:rPr>
+        <w:tab/>
       </w:r>
       <w:r>
         <w:rPr>
@@ -3750,7 +4071,7 @@
         </w:rPr>
         <w:t xml:space="preserve"> </w:t>
       </w:r>
-      <w:hyperlink r:id="rId24" w:history="1">
+      <w:hyperlink r:id="rId25" w:history="1">
         <w:r>
           <w:rPr>
             <w:rStyle w:val="Hyperlink"/>
@@ -3854,6 +4175,79 @@
       </w:pPr>
       <w:r>
         <w:rPr>
+          <w:b/>
+          <w:bCs/>
+          <w:noProof/>
+          <w:sz w:val="20"/>
+          <w:szCs w:val="20"/>
+        </w:rPr>
+        <mc:AlternateContent>
+          <mc:Choice Requires="wps">
+            <w:drawing>
+              <wp:anchor distT="0" distB="0" distL="114300" distR="114300" simplePos="0" relativeHeight="251679744" behindDoc="0" locked="0" layoutInCell="1" allowOverlap="1" wp14:anchorId="134CB454" wp14:editId="1F0DC272">
+                <wp:simplePos x="0" y="0"/>
+                <wp:positionH relativeFrom="column">
+                  <wp:posOffset>-346075</wp:posOffset>
+                </wp:positionH>
+                <wp:positionV relativeFrom="paragraph">
+                  <wp:posOffset>413566</wp:posOffset>
+                </wp:positionV>
+                <wp:extent cx="6638290" cy="0"/>
+                <wp:effectExtent l="0" t="0" r="0" b="0"/>
+                <wp:wrapNone/>
+                <wp:docPr id="9" name="Straight Connector 9"/>
+                <wp:cNvGraphicFramePr/>
+                <a:graphic xmlns:a="http://schemas.openxmlformats.org/drawingml/2006/main">
+                  <a:graphicData uri="http://schemas.microsoft.com/office/word/2010/wordprocessingShape">
+                    <wps:wsp>
+                      <wps:cNvCnPr/>
+                      <wps:spPr>
+                        <a:xfrm flipV="1">
+                          <a:off x="0" y="0"/>
+                          <a:ext cx="6638290" cy="0"/>
+                        </a:xfrm>
+                        <a:prstGeom prst="line">
+                          <a:avLst/>
+                        </a:prstGeom>
+                      </wps:spPr>
+                      <wps:style>
+                        <a:lnRef idx="1">
+                          <a:schemeClr val="dk1"/>
+                        </a:lnRef>
+                        <a:fillRef idx="0">
+                          <a:schemeClr val="dk1"/>
+                        </a:fillRef>
+                        <a:effectRef idx="0">
+                          <a:schemeClr val="dk1"/>
+                        </a:effectRef>
+                        <a:fontRef idx="minor">
+                          <a:schemeClr val="tx1"/>
+                        </a:fontRef>
+                      </wps:style>
+                      <wps:bodyPr/>
+                    </wps:wsp>
+                  </a:graphicData>
+                </a:graphic>
+                <wp14:sizeRelH relativeFrom="margin">
+                  <wp14:pctWidth>0</wp14:pctWidth>
+                </wp14:sizeRelH>
+                <wp14:sizeRelV relativeFrom="margin">
+                  <wp14:pctHeight>0</wp14:pctHeight>
+                </wp14:sizeRelV>
+              </wp:anchor>
+            </w:drawing>
+          </mc:Choice>
+          <mc:Fallback>
+            <w:pict>
+              <v:line w14:anchorId="6EF506B5" id="Straight Connector 9" o:spid="_x0000_s1026" style="position:absolute;flip:y;z-index:251679744;visibility:visible;mso-wrap-style:square;mso-width-percent:0;mso-height-percent:0;mso-wrap-distance-left:9pt;mso-wrap-distance-top:0;mso-wrap-distance-right:9pt;mso-wrap-distance-bottom:0;mso-position-horizontal:absolute;mso-position-horizontal-relative:text;mso-position-vertical:absolute;mso-position-vertical-relative:text;mso-width-percent:0;mso-height-percent:0;mso-width-relative:margin;mso-height-relative:margin" from="-27.25pt,32.55pt" to="495.45pt,32.55pt" o:gfxdata="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" strokecolor="black [3200]" strokeweight=".5pt">
+                <v:stroke joinstyle="miter"/>
+              </v:line>
+            </w:pict>
+          </mc:Fallback>
+        </mc:AlternateContent>
+      </w:r>
+      <w:r>
+        <w:rPr>
           <w:rFonts w:ascii="Roboto" w:hAnsi="Roboto"/>
           <w:b/>
           <w:bCs/>
@@ -3979,7 +4373,6 @@
           <w:szCs w:val="28"/>
           <w:lang w:bidi="fa-IR"/>
         </w:rPr>
-        <w:lastRenderedPageBreak/>
         <w:t>TECHNICAL SKILLS</w:t>
       </w:r>
     </w:p>
@@ -4251,7 +4644,7 @@
         <mc:AlternateContent>
           <mc:Choice Requires="wps">
             <w:drawing>
-              <wp:anchor distT="0" distB="0" distL="114300" distR="114300" simplePos="0" relativeHeight="251667456" behindDoc="0" locked="0" layoutInCell="1" allowOverlap="1" wp14:anchorId="76253802" wp14:editId="34FF6B0B">
+              <wp:anchor distT="0" distB="0" distL="114300" distR="114300" simplePos="0" relativeHeight="251667456" behindDoc="0" locked="0" layoutInCell="1" allowOverlap="1" wp14:anchorId="76253802" wp14:editId="292F73D8">
                 <wp:simplePos x="0" y="0"/>
                 <wp:positionH relativeFrom="column">
                   <wp:posOffset>-344170</wp:posOffset>
@@ -4306,7 +4699,7 @@
           </mc:Choice>
           <mc:Fallback>
             <w:pict>
-              <v:line w14:anchorId="25E1A181" id="Straight Connector 6" o:spid="_x0000_s1026" style="position:absolute;flip:y;z-index:251667456;visibility:visible;mso-wrap-style:square;mso-width-percent:0;mso-height-percent:0;mso-wrap-distance-left:9pt;mso-wrap-distance-top:0;mso-wrap-distance-right:9pt;mso-wrap-distance-bottom:0;mso-position-horizontal:absolute;mso-position-horizontal-relative:text;mso-position-vertical:absolute;mso-position-vertical-relative:text;mso-width-percent:0;mso-height-percent:0;mso-width-relative:margin;mso-height-relative:margin" from="-27.1pt,26.8pt" to="495.6pt,26.8pt" o:gfxdata="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" strokecolor="black [3200]" strokeweight=".5pt">
+              <v:line w14:anchorId="035E2268" id="Straight Connector 6" o:spid="_x0000_s1026" style="position:absolute;flip:y;z-index:251667456;visibility:visible;mso-wrap-style:square;mso-width-percent:0;mso-height-percent:0;mso-wrap-distance-left:9pt;mso-wrap-distance-top:0;mso-wrap-distance-right:9pt;mso-wrap-distance-bottom:0;mso-position-horizontal:absolute;mso-position-horizontal-relative:text;mso-position-vertical:absolute;mso-position-vertical-relative:text;mso-width-percent:0;mso-height-percent:0;mso-width-relative:margin;mso-height-relative:margin" from="-27.1pt,26.8pt" to="495.6pt,26.8pt" o:gfxdata="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" strokecolor="black [3200]" strokeweight=".5pt">
                 <v:stroke joinstyle="miter"/>
               </v:line>
             </w:pict>
@@ -4400,6 +4793,8 @@
           <w:rFonts w:ascii="Roboto" w:hAnsi="Roboto"/>
           <w:b/>
           <w:bCs/>
+          <w:sz w:val="20"/>
+          <w:szCs w:val="20"/>
           <w:lang w:bidi="fa-IR"/>
         </w:rPr>
       </w:pPr>
@@ -4439,6 +4834,41 @@
       <w:r>
         <w:rPr>
           <w:rFonts w:ascii="Roboto" w:hAnsi="Roboto"/>
+          <w:lang w:bidi="fa-IR"/>
+        </w:rPr>
+        <w:t xml:space="preserve">Aug </w:t>
+      </w:r>
+      <w:r>
+        <w:rPr>
+          <w:rFonts w:ascii="Roboto" w:hAnsi="Roboto"/>
+          <w:lang w:bidi="fa-IR"/>
+        </w:rPr>
+        <w:t>2021</w:t>
+      </w:r>
+      <w:r>
+        <w:rPr>
+          <w:rFonts w:ascii="Roboto" w:hAnsi="Roboto"/>
+          <w:lang w:bidi="fa-IR"/>
+        </w:rPr>
+        <w:t>-</w:t>
+      </w:r>
+      <w:r>
+        <w:rPr>
+          <w:rFonts w:ascii="Roboto" w:hAnsi="Roboto"/>
+          <w:lang w:bidi="fa-IR"/>
+        </w:rPr>
+        <w:t>Oct 202</w:t>
+      </w:r>
+      <w:r>
+        <w:rPr>
+          <w:rFonts w:ascii="Roboto" w:hAnsi="Roboto"/>
+          <w:lang w:bidi="fa-IR"/>
+        </w:rPr>
+        <w:t xml:space="preserve">1 </w:t>
+      </w:r>
+      <w:r>
+        <w:rPr>
+          <w:rFonts w:ascii="Roboto" w:hAnsi="Roboto"/>
           <w:b/>
           <w:bCs/>
           <w:sz w:val="24"/>
@@ -4474,25 +4904,7 @@
           <w:szCs w:val="24"/>
           <w:lang w:bidi="fa-IR"/>
         </w:rPr>
-        <w:t xml:space="preserve">, </w:t>
-      </w:r>
-      <w:r>
-        <w:rPr>
-          <w:rFonts w:ascii="Roboto" w:hAnsi="Roboto"/>
-          <w:sz w:val="24"/>
-          <w:szCs w:val="24"/>
-          <w:lang w:bidi="fa-IR"/>
-        </w:rPr>
-        <w:t>Aug</w:t>
-      </w:r>
-      <w:r>
-        <w:rPr>
-          <w:rFonts w:ascii="Roboto" w:hAnsi="Roboto"/>
-          <w:sz w:val="24"/>
-          <w:szCs w:val="24"/>
-          <w:lang w:bidi="fa-IR"/>
-        </w:rPr>
-        <w:t xml:space="preserve"> 2021</w:t>
+        <w:t>,</w:t>
       </w:r>
     </w:p>
     <w:p>
@@ -4559,7 +4971,14 @@
           <w:bCs/>
           <w:noProof/>
         </w:rPr>
-        <w:t xml:space="preserve"> ?</w:t>
+        <w:t xml:space="preserve"> </w:t>
+      </w:r>
+      <w:r>
+        <w:rPr>
+          <w:rFonts w:ascii="Roboto" w:hAnsi="Roboto"/>
+          <w:noProof/>
+        </w:rPr>
+        <w:t>During the apprenticeship, I have learned about physical attributes, setting up, and maintaining data centers in banks.</w:t>
       </w:r>
     </w:p>
     <w:p>
@@ -4813,7 +5232,35 @@
           <w:szCs w:val="24"/>
           <w:lang w:bidi="fa-IR"/>
         </w:rPr>
-        <w:t xml:space="preserve">the third </w:t>
+        <w:t xml:space="preserve">the </w:t>
+      </w:r>
+      <w:r>
+        <w:rPr>
+          <w:rFonts w:ascii="Roboto" w:hAnsi="Roboto"/>
+          <w:sz w:val="24"/>
+          <w:szCs w:val="24"/>
+          <w:lang w:bidi="fa-IR"/>
+        </w:rPr>
+        <w:t>3</w:t>
+      </w:r>
+      <w:r>
+        <w:rPr>
+          <w:rFonts w:ascii="Roboto" w:hAnsi="Roboto"/>
+          <w:sz w:val="24"/>
+          <w:szCs w:val="24"/>
+          <w:vertAlign w:val="superscript"/>
+          <w:lang w:bidi="fa-IR"/>
+        </w:rPr>
+        <w:t>rd</w:t>
+      </w:r>
+      <w:r>
+        <w:rPr>
+          <w:rFonts w:ascii="Roboto" w:hAnsi="Roboto"/>
+          <w:sz w:val="24"/>
+          <w:szCs w:val="24"/>
+          <w:lang w:bidi="fa-IR"/>
+        </w:rPr>
+        <w:t xml:space="preserve"> </w:t>
       </w:r>
       <w:r>
         <w:rPr>
@@ -4924,16 +5371,6 @@
           <w:rFonts w:ascii="Roboto" w:hAnsi="Roboto"/>
           <w:b/>
           <w:bCs/>
-          <w:noProof/>
-        </w:rPr>
-      </w:pPr>
-    </w:p>
-    <w:p>
-      <w:pPr>
-        <w:rPr>
-          <w:rFonts w:ascii="Roboto" w:hAnsi="Roboto"/>
-          <w:b/>
-          <w:bCs/>
           <w:sz w:val="28"/>
           <w:szCs w:val="28"/>
           <w:lang w:bidi="fa-IR"/>
@@ -4965,7 +5402,7 @@
           <w:lang w:bidi="fa-IR"/>
         </w:rPr>
       </w:pPr>
-      <w:hyperlink r:id="rId25" w:history="1">
+      <w:hyperlink r:id="rId26" w:history="1">
         <w:r>
           <w:rPr>
             <w:rStyle w:val="Hyperlink"/>
@@ -5087,7 +5524,7 @@
         </w:rPr>
         <w:t xml:space="preserve">Email: </w:t>
       </w:r>
-      <w:hyperlink r:id="rId26" w:history="1">
+      <w:hyperlink r:id="rId27" w:history="1">
         <w:r>
           <w:rPr>
             <w:rStyle w:val="Hyperlink"/>
@@ -5115,7 +5552,7 @@
           <w:lang w:bidi="fa-IR"/>
         </w:rPr>
       </w:pPr>
-      <w:hyperlink r:id="rId27" w:history="1">
+      <w:hyperlink r:id="rId28" w:history="1">
         <w:r>
           <w:rPr>
             <w:rStyle w:val="Hyperlink"/>
@@ -5226,7 +5663,7 @@
         </w:rPr>
         <w:t xml:space="preserve">Email: </w:t>
       </w:r>
-      <w:hyperlink r:id="rId28" w:history="1">
+      <w:hyperlink r:id="rId29" w:history="1">
         <w:r>
           <w:rPr>
             <w:rStyle w:val="Hyperlink"/>
@@ -5256,7 +5693,7 @@
           <w:lang w:bidi="fa-IR"/>
         </w:rPr>
       </w:pPr>
-      <w:hyperlink r:id="rId29" w:history="1">
+      <w:hyperlink r:id="rId30" w:history="1">
         <w:r>
           <w:rPr>
             <w:rStyle w:val="Hyperlink"/>
@@ -5369,7 +5806,7 @@
         </w:rPr>
         <w:t xml:space="preserve"> </w:t>
       </w:r>
-      <w:hyperlink r:id="rId30" w:history="1">
+      <w:hyperlink r:id="rId31" w:history="1">
         <w:r>
           <w:rPr>
             <w:rStyle w:val="Hyperlink"/>
@@ -5384,7 +5821,7 @@
       </w:hyperlink>
     </w:p>
     <w:sectPr>
-      <w:footerReference w:type="default" r:id="rId31"/>
+      <w:footerReference w:type="default" r:id="rId32"/>
       <w:pgSz w:w="12240" w:h="15840"/>
       <w:pgMar w:top="1440" w:right="1440" w:bottom="1440" w:left="1440" w:header="720" w:footer="720" w:gutter="0"/>
       <w:pgBorders w:offsetFrom="page">
@@ -5401,7 +5838,7 @@
 </file>
 
 <file path=word/endnotes.xml><?xml version="1.0" encoding="utf-8"?>
-<w:endnotes xmlns:wpc="http://schemas.microsoft.com/office/word/2010/wordprocessingCanvas" xmlns:cx="http://schemas.microsoft.com/office/drawing/2014/chartex" xmlns:cx1="http://schemas.microsoft.com/office/drawing/2015/9/8/chartex" xmlns:cx2="http://schemas.microsoft.com/office/drawing/2015/10/21/chartex" xmlns:cx3="http://schemas.microsoft.com/office/drawing/2016/5/9/chartex" xmlns:cx4="http://schemas.microsoft.com/office/drawing/2016/5/10/chartex" xmlns:cx5="http://schemas.microsoft.com/office/drawing/2016/5/11/chartex" xmlns:cx6="http://schemas.microsoft.com/office/drawing/2016/5/12/chartex" xmlns:cx7="http://schemas.microsoft.com/office/drawing/2016/5/13/chartex" xmlns:cx8="http://schemas.microsoft.com/office/drawing/2016/5/14/chartex" xmlns:mc="http://schemas.openxmlformats.org/markup-compatibility/2006" xmlns:aink="http://schemas.microsoft.com/office/drawing/2016/ink" xmlns:am3d="http://schemas.microsoft.com/office/drawing/2017/model3d" xmlns:o="urn:schemas-microsoft-com:office:office" xmlns:r="http://schemas.openxmlformats.org/officeDocument/2006/relationships" xmlns:m="http://schemas.openxmlformats.org/officeDocument/2006/math" xmlns:v="urn:schemas-microsoft-com:vml" xmlns:wp14="http://schemas.microsoft.com/office/word/2010/wordprocessingDrawing" xmlns:wp="http://schemas.openxmlformats.org/drawingml/2006/wordprocessingDrawing" xmlns:w10="urn:schemas-microsoft-com:office:word" xmlns:w="http://schemas.openxmlformats.org/wordprocessingml/2006/main" xmlns:w14="http://schemas.microsoft.com/office/word/2010/wordml" xmlns:w15="http://schemas.microsoft.com/office/word/2012/wordml" xmlns:w16cex="http://schemas.microsoft.com/office/word/2018/wordml/cex" xmlns:w16cid="http://schemas.microsoft.com/office/word/2016/wordml/cid" xmlns:w16="http://schemas.microsoft.com/office/word/2018/wordml" xmlns:w16sdtdh="http://schemas.microsoft.com/office/word/2020/wordml/sdtdatahash" xmlns:w16se="http://schemas.microsoft.com/office/word/2015/wordml/symex" xmlns:wpg="http://schemas.microsoft.com/office/word/2010/wordprocessingGroup" xmlns:wpi="http://schemas.microsoft.com/office/word/2010/wordprocessingInk" xmlns:wne="http://schemas.microsoft.com/office/word/2006/wordml" xmlns:wps="http://schemas.microsoft.com/office/word/2010/wordprocessingShape" mc:Ignorable="w14 w15 w16se w16cid w16 w16cex w16sdtdh wp14">
+<w:endnotes xmlns:wpc="http://schemas.microsoft.com/office/word/2010/wordprocessingCanvas" xmlns:cx="http://schemas.microsoft.com/office/drawing/2014/chartex" xmlns:cx1="http://schemas.microsoft.com/office/drawing/2015/9/8/chartex" xmlns:cx2="http://schemas.microsoft.com/office/drawing/2015/10/21/chartex" xmlns:cx3="http://schemas.microsoft.com/office/drawing/2016/5/9/chartex" xmlns:cx4="http://schemas.microsoft.com/office/drawing/2016/5/10/chartex" xmlns:cx5="http://schemas.microsoft.com/office/drawing/2016/5/11/chartex" xmlns:cx6="http://schemas.microsoft.com/office/drawing/2016/5/12/chartex" xmlns:cx7="http://schemas.microsoft.com/office/drawing/2016/5/13/chartex" xmlns:cx8="http://schemas.microsoft.com/office/drawing/2016/5/14/chartex" xmlns:mc="http://schemas.openxmlformats.org/markup-compatibility/2006" xmlns:aink="http://schemas.microsoft.com/office/drawing/2016/ink" xmlns:am3d="http://schemas.microsoft.com/office/drawing/2017/model3d" xmlns:o="urn:schemas-microsoft-com:office:office" xmlns:oel="http://schemas.microsoft.com/office/2019/extlst" xmlns:r="http://schemas.openxmlformats.org/officeDocument/2006/relationships" xmlns:m="http://schemas.openxmlformats.org/officeDocument/2006/math" xmlns:v="urn:schemas-microsoft-com:vml" xmlns:wp14="http://schemas.microsoft.com/office/word/2010/wordprocessingDrawing" xmlns:wp="http://schemas.openxmlformats.org/drawingml/2006/wordprocessingDrawing" xmlns:w10="urn:schemas-microsoft-com:office:word" xmlns:w="http://schemas.openxmlformats.org/wordprocessingml/2006/main" xmlns:w14="http://schemas.microsoft.com/office/word/2010/wordml" xmlns:w15="http://schemas.microsoft.com/office/word/2012/wordml" xmlns:w16cex="http://schemas.microsoft.com/office/word/2018/wordml/cex" xmlns:w16cid="http://schemas.microsoft.com/office/word/2016/wordml/cid" xmlns:w16="http://schemas.microsoft.com/office/word/2018/wordml" xmlns:w16sdtdh="http://schemas.microsoft.com/office/word/2020/wordml/sdtdatahash" xmlns:w16se="http://schemas.microsoft.com/office/word/2015/wordml/symex" xmlns:wpg="http://schemas.microsoft.com/office/word/2010/wordprocessingGroup" xmlns:wpi="http://schemas.microsoft.com/office/word/2010/wordprocessingInk" xmlns:wne="http://schemas.microsoft.com/office/word/2006/wordml" xmlns:wps="http://schemas.microsoft.com/office/word/2010/wordprocessingShape" mc:Ignorable="w14 w15 w16se w16cid w16 w16cex w16sdtdh wp14">
   <w:endnote w:type="separator" w:id="-1">
     <w:p>
       <w:pPr>
@@ -5426,7 +5863,7 @@
 </file>
 
 <file path=word/footer1.xml><?xml version="1.0" encoding="utf-8"?>
-<w:ftr xmlns:wpc="http://schemas.microsoft.com/office/word/2010/wordprocessingCanvas" xmlns:cx="http://schemas.microsoft.com/office/drawing/2014/chartex" xmlns:cx1="http://schemas.microsoft.com/office/drawing/2015/9/8/chartex" xmlns:cx2="http://schemas.microsoft.com/office/drawing/2015/10/21/chartex" xmlns:cx3="http://schemas.microsoft.com/office/drawing/2016/5/9/chartex" xmlns:cx4="http://schemas.microsoft.com/office/drawing/2016/5/10/chartex" xmlns:cx5="http://schemas.microsoft.com/office/drawing/2016/5/11/chartex" xmlns:cx6="http://schemas.microsoft.com/office/drawing/2016/5/12/chartex" xmlns:cx7="http://schemas.microsoft.com/office/drawing/2016/5/13/chartex" xmlns:cx8="http://schemas.microsoft.com/office/drawing/2016/5/14/chartex" xmlns:mc="http://schemas.openxmlformats.org/markup-compatibility/2006" xmlns:aink="http://schemas.microsoft.com/office/drawing/2016/ink" xmlns:am3d="http://schemas.microsoft.com/office/drawing/2017/model3d" xmlns:o="urn:schemas-microsoft-com:office:office" xmlns:r="http://schemas.openxmlformats.org/officeDocument/2006/relationships" xmlns:m="http://schemas.openxmlformats.org/officeDocument/2006/math" xmlns:v="urn:schemas-microsoft-com:vml" xmlns:wp14="http://schemas.microsoft.com/office/word/2010/wordprocessingDrawing" xmlns:wp="http://schemas.openxmlformats.org/drawingml/2006/wordprocessingDrawing" xmlns:w10="urn:schemas-microsoft-com:office:word" xmlns:w="http://schemas.openxmlformats.org/wordprocessingml/2006/main" xmlns:w14="http://schemas.microsoft.com/office/word/2010/wordml" xmlns:w15="http://schemas.microsoft.com/office/word/2012/wordml" xmlns:w16cex="http://schemas.microsoft.com/office/word/2018/wordml/cex" xmlns:w16cid="http://schemas.microsoft.com/office/word/2016/wordml/cid" xmlns:w16="http://schemas.microsoft.com/office/word/2018/wordml" xmlns:w16sdtdh="http://schemas.microsoft.com/office/word/2020/wordml/sdtdatahash" xmlns:w16se="http://schemas.microsoft.com/office/word/2015/wordml/symex" xmlns:wpg="http://schemas.microsoft.com/office/word/2010/wordprocessingGroup" xmlns:wpi="http://schemas.microsoft.com/office/word/2010/wordprocessingInk" xmlns:wne="http://schemas.microsoft.com/office/word/2006/wordml" xmlns:wps="http://schemas.microsoft.com/office/word/2010/wordprocessingShape" mc:Ignorable="w14 w15 w16se w16cid w16 w16cex w16sdtdh wp14">
+<w:ftr xmlns:wpc="http://schemas.microsoft.com/office/word/2010/wordprocessingCanvas" xmlns:cx="http://schemas.microsoft.com/office/drawing/2014/chartex" xmlns:cx1="http://schemas.microsoft.com/office/drawing/2015/9/8/chartex" xmlns:cx2="http://schemas.microsoft.com/office/drawing/2015/10/21/chartex" xmlns:cx3="http://schemas.microsoft.com/office/drawing/2016/5/9/chartex" xmlns:cx4="http://schemas.microsoft.com/office/drawing/2016/5/10/chartex" xmlns:cx5="http://schemas.microsoft.com/office/drawing/2016/5/11/chartex" xmlns:cx6="http://schemas.microsoft.com/office/drawing/2016/5/12/chartex" xmlns:cx7="http://schemas.microsoft.com/office/drawing/2016/5/13/chartex" xmlns:cx8="http://schemas.microsoft.com/office/drawing/2016/5/14/chartex" xmlns:mc="http://schemas.openxmlformats.org/markup-compatibility/2006" xmlns:aink="http://schemas.microsoft.com/office/drawing/2016/ink" xmlns:am3d="http://schemas.microsoft.com/office/drawing/2017/model3d" xmlns:o="urn:schemas-microsoft-com:office:office" xmlns:oel="http://schemas.microsoft.com/office/2019/extlst" xmlns:r="http://schemas.openxmlformats.org/officeDocument/2006/relationships" xmlns:m="http://schemas.openxmlformats.org/officeDocument/2006/math" xmlns:v="urn:schemas-microsoft-com:vml" xmlns:wp14="http://schemas.microsoft.com/office/word/2010/wordprocessingDrawing" xmlns:wp="http://schemas.openxmlformats.org/drawingml/2006/wordprocessingDrawing" xmlns:w10="urn:schemas-microsoft-com:office:word" xmlns:w="http://schemas.openxmlformats.org/wordprocessingml/2006/main" xmlns:w14="http://schemas.microsoft.com/office/word/2010/wordml" xmlns:w15="http://schemas.microsoft.com/office/word/2012/wordml" xmlns:w16cex="http://schemas.microsoft.com/office/word/2018/wordml/cex" xmlns:w16cid="http://schemas.microsoft.com/office/word/2016/wordml/cid" xmlns:w16="http://schemas.microsoft.com/office/word/2018/wordml" xmlns:w16sdtdh="http://schemas.microsoft.com/office/word/2020/wordml/sdtdatahash" xmlns:w16se="http://schemas.microsoft.com/office/word/2015/wordml/symex" xmlns:wpg="http://schemas.microsoft.com/office/word/2010/wordprocessingGroup" xmlns:wpi="http://schemas.microsoft.com/office/word/2010/wordprocessingInk" xmlns:wne="http://schemas.microsoft.com/office/word/2006/wordml" xmlns:wps="http://schemas.microsoft.com/office/word/2010/wordprocessingShape" mc:Ignorable="w14 w15 w16se w16cid w16 w16cex w16sdtdh wp14">
   <w:sdt>
     <w:sdtPr>
       <w:id w:val="2043244344"/>
@@ -5508,7 +5945,7 @@
 </file>
 
 <file path=word/footnotes.xml><?xml version="1.0" encoding="utf-8"?>
-<w:footnotes xmlns:wpc="http://schemas.microsoft.com/office/word/2010/wordprocessingCanvas" xmlns:cx="http://schemas.microsoft.com/office/drawing/2014/chartex" xmlns:cx1="http://schemas.microsoft.com/office/drawing/2015/9/8/chartex" xmlns:cx2="http://schemas.microsoft.com/office/drawing/2015/10/21/chartex" xmlns:cx3="http://schemas.microsoft.com/office/drawing/2016/5/9/chartex" xmlns:cx4="http://schemas.microsoft.com/office/drawing/2016/5/10/chartex" xmlns:cx5="http://schemas.microsoft.com/office/drawing/2016/5/11/chartex" xmlns:cx6="http://schemas.microsoft.com/office/drawing/2016/5/12/chartex" xmlns:cx7="http://schemas.microsoft.com/office/drawing/2016/5/13/chartex" xmlns:cx8="http://schemas.microsoft.com/office/drawing/2016/5/14/chartex" xmlns:mc="http://schemas.openxmlformats.org/markup-compatibility/2006" xmlns:aink="http://schemas.microsoft.com/office/drawing/2016/ink" xmlns:am3d="http://schemas.microsoft.com/office/drawing/2017/model3d" xmlns:o="urn:schemas-microsoft-com:office:office" xmlns:r="http://schemas.openxmlformats.org/officeDocument/2006/relationships" xmlns:m="http://schemas.openxmlformats.org/officeDocument/2006/math" xmlns:v="urn:schemas-microsoft-com:vml" xmlns:wp14="http://schemas.microsoft.com/office/word/2010/wordprocessingDrawing" xmlns:wp="http://schemas.openxmlformats.org/drawingml/2006/wordprocessingDrawing" xmlns:w10="urn:schemas-microsoft-com:office:word" xmlns:w="http://schemas.openxmlformats.org/wordprocessingml/2006/main" xmlns:w14="http://schemas.microsoft.com/office/word/2010/wordml" xmlns:w15="http://schemas.microsoft.com/office/word/2012/wordml" xmlns:w16cex="http://schemas.microsoft.com/office/word/2018/wordml/cex" xmlns:w16cid="http://schemas.microsoft.com/office/word/2016/wordml/cid" xmlns:w16="http://schemas.microsoft.com/office/word/2018/wordml" xmlns:w16sdtdh="http://schemas.microsoft.com/office/word/2020/wordml/sdtdatahash" xmlns:w16se="http://schemas.microsoft.com/office/word/2015/wordml/symex" xmlns:wpg="http://schemas.microsoft.com/office/word/2010/wordprocessingGroup" xmlns:wpi="http://schemas.microsoft.com/office/word/2010/wordprocessingInk" xmlns:wne="http://schemas.microsoft.com/office/word/2006/wordml" xmlns:wps="http://schemas.microsoft.com/office/word/2010/wordprocessingShape" mc:Ignorable="w14 w15 w16se w16cid w16 w16cex w16sdtdh wp14">
+<w:footnotes xmlns:wpc="http://schemas.microsoft.com/office/word/2010/wordprocessingCanvas" xmlns:cx="http://schemas.microsoft.com/office/drawing/2014/chartex" xmlns:cx1="http://schemas.microsoft.com/office/drawing/2015/9/8/chartex" xmlns:cx2="http://schemas.microsoft.com/office/drawing/2015/10/21/chartex" xmlns:cx3="http://schemas.microsoft.com/office/drawing/2016/5/9/chartex" xmlns:cx4="http://schemas.microsoft.com/office/drawing/2016/5/10/chartex" xmlns:cx5="http://schemas.microsoft.com/office/drawing/2016/5/11/chartex" xmlns:cx6="http://schemas.microsoft.com/office/drawing/2016/5/12/chartex" xmlns:cx7="http://schemas.microsoft.com/office/drawing/2016/5/13/chartex" xmlns:cx8="http://schemas.microsoft.com/office/drawing/2016/5/14/chartex" xmlns:mc="http://schemas.openxmlformats.org/markup-compatibility/2006" xmlns:aink="http://schemas.microsoft.com/office/drawing/2016/ink" xmlns:am3d="http://schemas.microsoft.com/office/drawing/2017/model3d" xmlns:o="urn:schemas-microsoft-com:office:office" xmlns:oel="http://schemas.microsoft.com/office/2019/extlst" xmlns:r="http://schemas.openxmlformats.org/officeDocument/2006/relationships" xmlns:m="http://schemas.openxmlformats.org/officeDocument/2006/math" xmlns:v="urn:schemas-microsoft-com:vml" xmlns:wp14="http://schemas.microsoft.com/office/word/2010/wordprocessingDrawing" xmlns:wp="http://schemas.openxmlformats.org/drawingml/2006/wordprocessingDrawing" xmlns:w10="urn:schemas-microsoft-com:office:word" xmlns:w="http://schemas.openxmlformats.org/wordprocessingml/2006/main" xmlns:w14="http://schemas.microsoft.com/office/word/2010/wordml" xmlns:w15="http://schemas.microsoft.com/office/word/2012/wordml" xmlns:w16cex="http://schemas.microsoft.com/office/word/2018/wordml/cex" xmlns:w16cid="http://schemas.microsoft.com/office/word/2016/wordml/cid" xmlns:w16="http://schemas.microsoft.com/office/word/2018/wordml" xmlns:w16sdtdh="http://schemas.microsoft.com/office/word/2020/wordml/sdtdatahash" xmlns:w16se="http://schemas.microsoft.com/office/word/2015/wordml/symex" xmlns:wpg="http://schemas.microsoft.com/office/word/2010/wordprocessingGroup" xmlns:wpi="http://schemas.microsoft.com/office/word/2010/wordprocessingInk" xmlns:wne="http://schemas.microsoft.com/office/word/2006/wordml" xmlns:wps="http://schemas.microsoft.com/office/word/2010/wordprocessingShape" mc:Ignorable="w14 w15 w16se w16cid w16 w16cex w16sdtdh wp14">
   <w:footnote w:type="separator" w:id="-1">
     <w:p>
       <w:pPr>
@@ -5533,7 +5970,7 @@
 </file>
 
 <file path=word/numbering.xml><?xml version="1.0" encoding="utf-8"?>
-<w:numbering xmlns:wpc="http://schemas.microsoft.com/office/word/2010/wordprocessingCanvas" xmlns:cx="http://schemas.microsoft.com/office/drawing/2014/chartex" xmlns:cx1="http://schemas.microsoft.com/office/drawing/2015/9/8/chartex" xmlns:cx2="http://schemas.microsoft.com/office/drawing/2015/10/21/chartex" xmlns:cx3="http://schemas.microsoft.com/office/drawing/2016/5/9/chartex" xmlns:cx4="http://schemas.microsoft.com/office/drawing/2016/5/10/chartex" xmlns:cx5="http://schemas.microsoft.com/office/drawing/2016/5/11/chartex" xmlns:cx6="http://schemas.microsoft.com/office/drawing/2016/5/12/chartex" xmlns:cx7="http://schemas.microsoft.com/office/drawing/2016/5/13/chartex" xmlns:cx8="http://schemas.microsoft.com/office/drawing/2016/5/14/chartex" xmlns:mc="http://schemas.openxmlformats.org/markup-compatibility/2006" xmlns:aink="http://schemas.microsoft.com/office/drawing/2016/ink" xmlns:am3d="http://schemas.microsoft.com/office/drawing/2017/model3d" xmlns:o="urn:schemas-microsoft-com:office:office" xmlns:r="http://schemas.openxmlformats.org/officeDocument/2006/relationships" xmlns:m="http://schemas.openxmlformats.org/officeDocument/2006/math" xmlns:v="urn:schemas-microsoft-com:vml" xmlns:wp14="http://schemas.microsoft.com/office/word/2010/wordprocessingDrawing" xmlns:wp="http://schemas.openxmlformats.org/drawingml/2006/wordprocessingDrawing" xmlns:w10="urn:schemas-microsoft-com:office:word" xmlns:w="http://schemas.openxmlformats.org/wordprocessingml/2006/main" xmlns:w14="http://schemas.microsoft.com/office/word/2010/wordml" xmlns:w15="http://schemas.microsoft.com/office/word/2012/wordml" xmlns:w16cex="http://schemas.microsoft.com/office/word/2018/wordml/cex" xmlns:w16cid="http://schemas.microsoft.com/office/word/2016/wordml/cid" xmlns:w16="http://schemas.microsoft.com/office/word/2018/wordml" xmlns:w16sdtdh="http://schemas.microsoft.com/office/word/2020/wordml/sdtdatahash" xmlns:w16se="http://schemas.microsoft.com/office/word/2015/wordml/symex" xmlns:wpg="http://schemas.microsoft.com/office/word/2010/wordprocessingGroup" xmlns:wpi="http://schemas.microsoft.com/office/word/2010/wordprocessingInk" xmlns:wne="http://schemas.microsoft.com/office/word/2006/wordml" xmlns:wps="http://schemas.microsoft.com/office/word/2010/wordprocessingShape" mc:Ignorable="w14 w15 w16se w16cid w16 w16cex w16sdtdh wp14">
+<w:numbering xmlns:wpc="http://schemas.microsoft.com/office/word/2010/wordprocessingCanvas" xmlns:cx="http://schemas.microsoft.com/office/drawing/2014/chartex" xmlns:cx1="http://schemas.microsoft.com/office/drawing/2015/9/8/chartex" xmlns:cx2="http://schemas.microsoft.com/office/drawing/2015/10/21/chartex" xmlns:cx3="http://schemas.microsoft.com/office/drawing/2016/5/9/chartex" xmlns:cx4="http://schemas.microsoft.com/office/drawing/2016/5/10/chartex" xmlns:cx5="http://schemas.microsoft.com/office/drawing/2016/5/11/chartex" xmlns:cx6="http://schemas.microsoft.com/office/drawing/2016/5/12/chartex" xmlns:cx7="http://schemas.microsoft.com/office/drawing/2016/5/13/chartex" xmlns:cx8="http://schemas.microsoft.com/office/drawing/2016/5/14/chartex" xmlns:mc="http://schemas.openxmlformats.org/markup-compatibility/2006" xmlns:aink="http://schemas.microsoft.com/office/drawing/2016/ink" xmlns:am3d="http://schemas.microsoft.com/office/drawing/2017/model3d" xmlns:o="urn:schemas-microsoft-com:office:office" xmlns:oel="http://schemas.microsoft.com/office/2019/extlst" xmlns:r="http://schemas.openxmlformats.org/officeDocument/2006/relationships" xmlns:m="http://schemas.openxmlformats.org/officeDocument/2006/math" xmlns:v="urn:schemas-microsoft-com:vml" xmlns:wp14="http://schemas.microsoft.com/office/word/2010/wordprocessingDrawing" xmlns:wp="http://schemas.openxmlformats.org/drawingml/2006/wordprocessingDrawing" xmlns:w10="urn:schemas-microsoft-com:office:word" xmlns:w="http://schemas.openxmlformats.org/wordprocessingml/2006/main" xmlns:w14="http://schemas.microsoft.com/office/word/2010/wordml" xmlns:w15="http://schemas.microsoft.com/office/word/2012/wordml" xmlns:w16cex="http://schemas.microsoft.com/office/word/2018/wordml/cex" xmlns:w16cid="http://schemas.microsoft.com/office/word/2016/wordml/cid" xmlns:w16="http://schemas.microsoft.com/office/word/2018/wordml" xmlns:w16sdtdh="http://schemas.microsoft.com/office/word/2020/wordml/sdtdatahash" xmlns:w16se="http://schemas.microsoft.com/office/word/2015/wordml/symex" xmlns:wpg="http://schemas.microsoft.com/office/word/2010/wordprocessingGroup" xmlns:wpi="http://schemas.microsoft.com/office/word/2010/wordprocessingInk" xmlns:wne="http://schemas.microsoft.com/office/word/2006/wordml" xmlns:wps="http://schemas.microsoft.com/office/word/2010/wordprocessingShape" mc:Ignorable="w14 w15 w16se w16cid w16 w16cex w16sdtdh wp14">
   <w:abstractNum w:abstractNumId="0" w15:restartNumberingAfterBreak="0">
     <w:nsid w:val="087C3772"/>
     <w:multiLevelType w:val="hybridMultilevel"/>

</xml_diff>